<commit_message>
Solution to fractional knapsack problem
</commit_message>
<xml_diff>
--- a/Lab4/W1D4 2025.docx
+++ b/Lab4/W1D4 2025.docx
@@ -157,71 +157,7 @@
           <w:bCs/>
           <w:color w:val="467886" w:themeColor="hyperlink"/>
         </w:rPr>
-        <w:t xml:space="preserve">public static void </w:t>
-      </w:r>
-      <w:proofErr w:type="spellStart"/>
-      <w:proofErr w:type="gramStart"/>
-      <w:r>
-        <w:rPr>
-          <w:b/>
-          <w:bCs/>
-          <w:color w:val="467886" w:themeColor="hyperlink"/>
-        </w:rPr>
-        <w:t>subsetOfN</w:t>
-      </w:r>
-      <w:proofErr w:type="spellEnd"/>
-      <w:r>
-        <w:rPr>
-          <w:b/>
-          <w:bCs/>
-          <w:color w:val="467886" w:themeColor="hyperlink"/>
-        </w:rPr>
-        <w:t>(</w:t>
-      </w:r>
-      <w:proofErr w:type="gramEnd"/>
-      <w:r>
-        <w:rPr>
-          <w:b/>
-          <w:bCs/>
-          <w:color w:val="467886" w:themeColor="hyperlink"/>
-        </w:rPr>
-        <w:t xml:space="preserve">int [] </w:t>
-      </w:r>
-      <w:proofErr w:type="spellStart"/>
-      <w:r>
-        <w:rPr>
-          <w:b/>
-          <w:bCs/>
-          <w:color w:val="467886" w:themeColor="hyperlink"/>
-        </w:rPr>
-        <w:t>arr</w:t>
-      </w:r>
-      <w:proofErr w:type="spellEnd"/>
-      <w:r>
-        <w:rPr>
-          <w:b/>
-          <w:bCs/>
-          <w:color w:val="467886" w:themeColor="hyperlink"/>
-        </w:rPr>
-        <w:t xml:space="preserve">, int </w:t>
-      </w:r>
-      <w:proofErr w:type="spellStart"/>
-      <w:r>
-        <w:rPr>
-          <w:b/>
-          <w:bCs/>
-          <w:color w:val="467886" w:themeColor="hyperlink"/>
-        </w:rPr>
-        <w:t>taget</w:t>
-      </w:r>
-      <w:proofErr w:type="spellEnd"/>
-      <w:r>
-        <w:rPr>
-          <w:b/>
-          <w:bCs/>
-          <w:color w:val="467886" w:themeColor="hyperlink"/>
-        </w:rPr>
-        <w:t>)</w:t>
+        <w:t>public static void subsetOfN(int [] arr, int taget)</w:t>
       </w:r>
     </w:p>
     <w:p>
@@ -4494,18 +4430,8 @@
           <w:bCs/>
           <w:color w:val="467886" w:themeColor="hyperlink"/>
         </w:rPr>
-        <w:t xml:space="preserve">Solution: using </w:t>
+        <w:t>Solution: using dp</w:t>
       </w:r>
-      <w:proofErr w:type="spellStart"/>
-      <w:r>
-        <w:rPr>
-          <w:b/>
-          <w:bCs/>
-          <w:color w:val="467886" w:themeColor="hyperlink"/>
-        </w:rPr>
-        <w:t>dp</w:t>
-      </w:r>
-      <w:proofErr w:type="spellEnd"/>
       <w:r>
         <w:rPr>
           <w:b/>
@@ -5793,29 +5719,7 @@
                 <w:sz w:val="18"/>
                 <w:szCs w:val="18"/>
               </w:rPr>
-              <w:t>{</w:t>
-            </w:r>
-            <w:proofErr w:type="gramStart"/>
-            <w:r>
-              <w:rPr>
-                <w:b/>
-                <w:bCs/>
-                <w:color w:val="467886" w:themeColor="hyperlink"/>
-                <w:sz w:val="18"/>
-                <w:szCs w:val="18"/>
-              </w:rPr>
-              <w:t>7}{</w:t>
-            </w:r>
-            <w:proofErr w:type="gramEnd"/>
-            <w:r>
-              <w:rPr>
-                <w:b/>
-                <w:bCs/>
-                <w:color w:val="467886" w:themeColor="hyperlink"/>
-                <w:sz w:val="18"/>
-                <w:szCs w:val="18"/>
-              </w:rPr>
-              <w:t>3,4}</w:t>
+              <w:t>{7}{3,4}</w:t>
             </w:r>
           </w:p>
         </w:tc>
@@ -6169,29 +6073,7 @@
                 <w:sz w:val="18"/>
                 <w:szCs w:val="18"/>
               </w:rPr>
-              <w:t>{</w:t>
-            </w:r>
-            <w:proofErr w:type="gramStart"/>
-            <w:r>
-              <w:rPr>
-                <w:b/>
-                <w:bCs/>
-                <w:color w:val="467886" w:themeColor="hyperlink"/>
-                <w:sz w:val="18"/>
-                <w:szCs w:val="18"/>
-              </w:rPr>
-              <w:t>7}{</w:t>
-            </w:r>
-            <w:proofErr w:type="gramEnd"/>
-            <w:r>
-              <w:rPr>
-                <w:b/>
-                <w:bCs/>
-                <w:color w:val="467886" w:themeColor="hyperlink"/>
-                <w:sz w:val="18"/>
-                <w:szCs w:val="18"/>
-              </w:rPr>
-              <w:t>3,4}</w:t>
+              <w:t>{7}{3,4}</w:t>
             </w:r>
           </w:p>
         </w:tc>
@@ -6285,39 +6167,17 @@
                 <w:sz w:val="18"/>
                 <w:szCs w:val="18"/>
               </w:rPr>
-              <w:t>{4,</w:t>
-            </w:r>
-            <w:proofErr w:type="gramStart"/>
-            <w:r>
-              <w:rPr>
-                <w:b/>
-                <w:bCs/>
-                <w:color w:val="467886" w:themeColor="hyperlink"/>
-                <w:sz w:val="18"/>
-                <w:szCs w:val="18"/>
-              </w:rPr>
-              <w:t>7}</w:t>
-            </w:r>
-            <w:r>
-              <w:rPr>
-                <w:b/>
-                <w:bCs/>
-                <w:color w:val="467886" w:themeColor="hyperlink"/>
-                <w:sz w:val="18"/>
-                <w:szCs w:val="18"/>
-              </w:rPr>
-              <w:t>{</w:t>
-            </w:r>
-            <w:proofErr w:type="gramEnd"/>
-            <w:r>
-              <w:rPr>
-                <w:b/>
-                <w:bCs/>
-                <w:color w:val="467886" w:themeColor="hyperlink"/>
-                <w:sz w:val="18"/>
-                <w:szCs w:val="18"/>
-              </w:rPr>
-              <w:t>3,8}</w:t>
+              <w:t>{4,7}</w:t>
+            </w:r>
+            <w:r>
+              <w:rPr>
+                <w:b/>
+                <w:bCs/>
+                <w:color w:val="467886" w:themeColor="hyperlink"/>
+                <w:sz w:val="18"/>
+                <w:szCs w:val="18"/>
+              </w:rPr>
+              <w:t>{3,8}</w:t>
             </w:r>
           </w:p>
         </w:tc>
@@ -6411,29 +6271,7 @@
                 <w:sz w:val="18"/>
                 <w:szCs w:val="18"/>
               </w:rPr>
-              <w:t>{3,4,</w:t>
-            </w:r>
-            <w:proofErr w:type="gramStart"/>
-            <w:r>
-              <w:rPr>
-                <w:b/>
-                <w:bCs/>
-                <w:color w:val="467886" w:themeColor="hyperlink"/>
-                <w:sz w:val="18"/>
-                <w:szCs w:val="18"/>
-              </w:rPr>
-              <w:t>8}{</w:t>
-            </w:r>
-            <w:proofErr w:type="gramEnd"/>
-            <w:r>
-              <w:rPr>
-                <w:b/>
-                <w:bCs/>
-                <w:color w:val="467886" w:themeColor="hyperlink"/>
-                <w:sz w:val="18"/>
-                <w:szCs w:val="18"/>
-              </w:rPr>
-              <w:t>7,8}</w:t>
+              <w:t>{3,4,8}{7,8}</w:t>
             </w:r>
           </w:p>
         </w:tc>
@@ -6509,29 +6347,7 @@
           <w:iCs/>
           <w:color w:val="467886" w:themeColor="hyperlink"/>
         </w:rPr>
-        <w:t xml:space="preserve">The maximum allowable total weight in the knapsack is </w:t>
-      </w:r>
-      <w:proofErr w:type="spellStart"/>
-      <w:r>
-        <w:rPr>
-          <w:b/>
-          <w:bCs/>
-          <w:i/>
-          <w:iCs/>
-          <w:color w:val="467886" w:themeColor="hyperlink"/>
-        </w:rPr>
-        <w:t>Wmax</w:t>
-      </w:r>
-      <w:proofErr w:type="spellEnd"/>
-      <w:r>
-        <w:rPr>
-          <w:b/>
-          <w:bCs/>
-          <w:i/>
-          <w:iCs/>
-          <w:color w:val="467886" w:themeColor="hyperlink"/>
-        </w:rPr>
-        <w:t xml:space="preserve"> = 20.</w:t>
+        <w:t>The maximum allowable total weight in the knapsack is Wmax = 20.</w:t>
       </w:r>
     </w:p>
     <w:tbl>
@@ -7838,29 +7654,16 @@
                 <w:szCs w:val="16"/>
               </w:rPr>
             </w:pPr>
-            <w:proofErr w:type="gramStart"/>
-            <w:r>
-              <w:rPr>
-                <w:rFonts w:ascii="BatangChe" w:eastAsia="BatangChe" w:hAnsi="BatangChe"/>
-                <w:b/>
-                <w:bCs/>
-                <w:color w:val="467886" w:themeColor="hyperlink"/>
-                <w:sz w:val="16"/>
-                <w:szCs w:val="16"/>
-              </w:rPr>
-              <w:t>a(</w:t>
-            </w:r>
-            <w:proofErr w:type="gramEnd"/>
-            <w:r>
-              <w:rPr>
-                <w:rFonts w:ascii="BatangChe" w:eastAsia="BatangChe" w:hAnsi="BatangChe"/>
-                <w:b/>
-                <w:bCs/>
-                <w:color w:val="467886" w:themeColor="hyperlink"/>
-                <w:sz w:val="16"/>
-                <w:szCs w:val="16"/>
-              </w:rPr>
-              <w:t>5,25)</w:t>
+            <w:r>
+              <w:rPr>
+                <w:rFonts w:ascii="BatangChe" w:eastAsia="BatangChe" w:hAnsi="BatangChe"/>
+                <w:b/>
+                <w:bCs/>
+                <w:color w:val="467886" w:themeColor="hyperlink"/>
+                <w:sz w:val="16"/>
+                <w:szCs w:val="16"/>
+              </w:rPr>
+              <w:t>a(5,25)</w:t>
             </w:r>
           </w:p>
         </w:tc>
@@ -8441,7 +8244,6 @@
                 <w:szCs w:val="16"/>
               </w:rPr>
             </w:pPr>
-            <w:proofErr w:type="gramStart"/>
             <w:r>
               <w:rPr>
                 <w:rFonts w:ascii="BatangChe" w:eastAsia="BatangChe" w:hAnsi="BatangChe"/>
@@ -8464,7 +8266,6 @@
               </w:rPr>
               <w:t>(</w:t>
             </w:r>
-            <w:proofErr w:type="gramEnd"/>
             <w:r>
               <w:rPr>
                 <w:rFonts w:ascii="BatangChe" w:eastAsia="BatangChe" w:hAnsi="BatangChe"/>
@@ -9088,7 +8889,6 @@
                 <w:szCs w:val="16"/>
               </w:rPr>
             </w:pPr>
-            <w:proofErr w:type="gramStart"/>
             <w:r>
               <w:rPr>
                 <w:rFonts w:ascii="BatangChe" w:eastAsia="BatangChe" w:hAnsi="BatangChe"/>
@@ -9111,7 +8911,6 @@
               </w:rPr>
               <w:t>(</w:t>
             </w:r>
-            <w:proofErr w:type="gramEnd"/>
             <w:r>
               <w:rPr>
                 <w:rFonts w:ascii="BatangChe" w:eastAsia="BatangChe" w:hAnsi="BatangChe"/>
@@ -9735,7 +9534,6 @@
                 <w:szCs w:val="16"/>
               </w:rPr>
             </w:pPr>
-            <w:proofErr w:type="gramStart"/>
             <w:r>
               <w:rPr>
                 <w:rFonts w:ascii="BatangChe" w:eastAsia="BatangChe" w:hAnsi="BatangChe"/>
@@ -9756,19 +9554,7 @@
                 <w:sz w:val="16"/>
                 <w:szCs w:val="16"/>
               </w:rPr>
-              <w:t>(</w:t>
-            </w:r>
-            <w:proofErr w:type="gramEnd"/>
-            <w:r>
-              <w:rPr>
-                <w:rFonts w:ascii="BatangChe" w:eastAsia="BatangChe" w:hAnsi="BatangChe"/>
-                <w:b/>
-                <w:bCs/>
-                <w:color w:val="467886" w:themeColor="hyperlink"/>
-                <w:sz w:val="16"/>
-                <w:szCs w:val="16"/>
-              </w:rPr>
-              <w:t>2,</w:t>
+              <w:t>(2,</w:t>
             </w:r>
             <w:r>
               <w:rPr>
@@ -10371,7 +10157,6 @@
                 <w:szCs w:val="16"/>
               </w:rPr>
             </w:pPr>
-            <w:proofErr w:type="gramStart"/>
             <w:r>
               <w:rPr>
                 <w:rFonts w:ascii="BatangChe" w:eastAsia="BatangChe" w:hAnsi="BatangChe"/>
@@ -10394,7 +10179,6 @@
               </w:rPr>
               <w:t>(</w:t>
             </w:r>
-            <w:proofErr w:type="gramEnd"/>
             <w:r>
               <w:rPr>
                 <w:rFonts w:ascii="BatangChe" w:eastAsia="BatangChe" w:hAnsi="BatangChe"/>
@@ -11000,29 +10784,7 @@
           <w:sz w:val="18"/>
           <w:szCs w:val="18"/>
         </w:rPr>
-        <w:t xml:space="preserve">Total value </w:t>
-      </w:r>
-      <w:proofErr w:type="gramStart"/>
-      <w:r>
-        <w:rPr>
-          <w:b/>
-          <w:bCs/>
-          <w:color w:val="467886" w:themeColor="hyperlink"/>
-          <w:sz w:val="18"/>
-          <w:szCs w:val="18"/>
-        </w:rPr>
-        <w:t>is  81</w:t>
-      </w:r>
-      <w:proofErr w:type="gramEnd"/>
-      <w:r>
-        <w:rPr>
-          <w:b/>
-          <w:bCs/>
-          <w:color w:val="467886" w:themeColor="hyperlink"/>
-          <w:sz w:val="18"/>
-          <w:szCs w:val="18"/>
-        </w:rPr>
-        <w:t xml:space="preserve"> </w:t>
+        <w:t xml:space="preserve">Total value is  81 </w:t>
       </w:r>
     </w:p>
     <w:p>
@@ -11058,7 +10820,6 @@
           <w:szCs w:val="18"/>
         </w:rPr>
       </w:pPr>
-      <w:proofErr w:type="gramStart"/>
       <w:r>
         <w:rPr>
           <w:b/>
@@ -11067,18 +10828,7 @@
           <w:sz w:val="18"/>
           <w:szCs w:val="18"/>
         </w:rPr>
-        <w:t>Total  w</w:t>
-      </w:r>
-      <w:proofErr w:type="gramEnd"/>
-      <w:r>
-        <w:rPr>
-          <w:b/>
-          <w:bCs/>
-          <w:color w:val="467886" w:themeColor="hyperlink"/>
-          <w:sz w:val="18"/>
-          <w:szCs w:val="18"/>
-        </w:rPr>
-        <w:t xml:space="preserve"> =</w:t>
+        <w:t>Total  w =</w:t>
       </w:r>
       <w:r>
         <w:rPr>
@@ -11112,7 +10862,6 @@
           <w:szCs w:val="18"/>
         </w:rPr>
       </w:pPr>
-      <w:proofErr w:type="gramStart"/>
       <w:r>
         <w:rPr>
           <w:b/>
@@ -11131,18 +10880,7 @@
           <w:sz w:val="18"/>
           <w:szCs w:val="18"/>
         </w:rPr>
-        <w:t>e</w:t>
-      </w:r>
-      <w:proofErr w:type="gramEnd"/>
-      <w:r>
-        <w:rPr>
-          <w:b/>
-          <w:bCs/>
-          <w:color w:val="467886" w:themeColor="hyperlink"/>
-          <w:sz w:val="18"/>
-          <w:szCs w:val="18"/>
-        </w:rPr>
-        <w:t xml:space="preserve">   - 7, 28</w:t>
+        <w:t>e   - 7, 28</w:t>
       </w:r>
     </w:p>
     <w:tbl>
@@ -11828,119 +11566,8 @@
           <w:sz w:val="18"/>
           <w:szCs w:val="18"/>
         </w:rPr>
-        <w:t>Items in the sack = {</w:t>
+        <w:t>Items in the sack = {a,b,d,e}</w:t>
       </w:r>
-      <w:proofErr w:type="spellStart"/>
-      <w:proofErr w:type="gramStart"/>
-      <w:r>
-        <w:rPr>
-          <w:b/>
-          <w:bCs/>
-          <w:color w:val="467886" w:themeColor="hyperlink"/>
-          <w:sz w:val="18"/>
-          <w:szCs w:val="18"/>
-        </w:rPr>
-        <w:t>a,b</w:t>
-      </w:r>
-      <w:proofErr w:type="gramEnd"/>
-      <w:r>
-        <w:rPr>
-          <w:b/>
-          <w:bCs/>
-          <w:color w:val="467886" w:themeColor="hyperlink"/>
-          <w:sz w:val="18"/>
-          <w:szCs w:val="18"/>
-        </w:rPr>
-        <w:t>,</w:t>
-      </w:r>
-      <w:proofErr w:type="gramStart"/>
-      <w:r>
-        <w:rPr>
-          <w:b/>
-          <w:bCs/>
-          <w:color w:val="467886" w:themeColor="hyperlink"/>
-          <w:sz w:val="18"/>
-          <w:szCs w:val="18"/>
-        </w:rPr>
-        <w:t>d,e</w:t>
-      </w:r>
-      <w:proofErr w:type="spellEnd"/>
-      <w:proofErr w:type="gramEnd"/>
-      <w:r>
-        <w:rPr>
-          <w:b/>
-          <w:bCs/>
-          <w:color w:val="467886" w:themeColor="hyperlink"/>
-          <w:sz w:val="18"/>
-          <w:szCs w:val="18"/>
-        </w:rPr>
-        <w:t>}</w:t>
-      </w:r>
-    </w:p>
-    <w:p>
-      <w:pPr>
-        <w:rPr>
-          <w:b/>
-          <w:bCs/>
-          <w:color w:val="467886" w:themeColor="hyperlink"/>
-          <w:sz w:val="18"/>
-          <w:szCs w:val="18"/>
-        </w:rPr>
-      </w:pPr>
-    </w:p>
-    <w:p>
-      <w:pPr>
-        <w:rPr>
-          <w:b/>
-          <w:bCs/>
-          <w:color w:val="467886" w:themeColor="hyperlink"/>
-        </w:rPr>
-      </w:pPr>
-    </w:p>
-    <w:p>
-      <w:pPr>
-        <w:rPr>
-          <w:b/>
-          <w:bCs/>
-          <w:color w:val="467886" w:themeColor="hyperlink"/>
-        </w:rPr>
-      </w:pPr>
-    </w:p>
-    <w:p>
-      <w:pPr>
-        <w:rPr>
-          <w:b/>
-          <w:bCs/>
-          <w:color w:val="467886" w:themeColor="hyperlink"/>
-        </w:rPr>
-      </w:pPr>
-    </w:p>
-    <w:p>
-      <w:pPr>
-        <w:rPr>
-          <w:b/>
-          <w:bCs/>
-          <w:color w:val="467886" w:themeColor="hyperlink"/>
-        </w:rPr>
-      </w:pPr>
-    </w:p>
-    <w:p>
-      <w:pPr>
-        <w:rPr>
-          <w:b/>
-          <w:bCs/>
-          <w:color w:val="467886" w:themeColor="hyperlink"/>
-        </w:rPr>
-      </w:pPr>
-    </w:p>
-    <w:p>
-      <w:pPr>
-        <w:rPr>
-          <w:b/>
-          <w:bCs/>
-          <w:color w:val="467886" w:themeColor="hyperlink"/>
-        </w:rPr>
-      </w:pPr>
     </w:p>
     <w:p>
       <w:pPr>
@@ -11993,29 +11620,7 @@
           <w:iCs/>
           <w:color w:val="467886" w:themeColor="hyperlink"/>
         </w:rPr>
-        <w:t xml:space="preserve">The maximum allowable total weight in the knapsack is </w:t>
-      </w:r>
-      <w:proofErr w:type="spellStart"/>
-      <w:r>
-        <w:rPr>
-          <w:b/>
-          <w:bCs/>
-          <w:i/>
-          <w:iCs/>
-          <w:color w:val="467886" w:themeColor="hyperlink"/>
-        </w:rPr>
-        <w:t>Wmax</w:t>
-      </w:r>
-      <w:proofErr w:type="spellEnd"/>
-      <w:r>
-        <w:rPr>
-          <w:b/>
-          <w:bCs/>
-          <w:i/>
-          <w:iCs/>
-          <w:color w:val="467886" w:themeColor="hyperlink"/>
-        </w:rPr>
-        <w:t xml:space="preserve"> = 20.</w:t>
+        <w:t>The maximum allowable total weight in the knapsack is Wmax = 20.</w:t>
       </w:r>
     </w:p>
     <w:tbl>
@@ -12070,7 +11675,6 @@
                 <w:bCs/>
                 <w:color w:val="467886" w:themeColor="hyperlink"/>
               </w:rPr>
-              <w:lastRenderedPageBreak/>
               <w:t>Item</w:t>
             </w:r>
           </w:p>
@@ -12697,6 +12301,729 @@
           <w:u w:val="single"/>
         </w:rPr>
       </w:pPr>
+      <w:r>
+        <w:rPr>
+          <w:b/>
+          <w:bCs/>
+          <w:color w:val="467886" w:themeColor="hyperlink"/>
+          <w:u w:val="single"/>
+        </w:rPr>
+        <w:t>Solution</w:t>
+      </w:r>
+    </w:p>
+    <w:tbl>
+      <w:tblPr>
+        <w:tblStyle w:val="TableGrid"/>
+        <w:tblW w:w="9535" w:type="dxa"/>
+        <w:tblLook w:val="04A0" w:firstRow="1" w:lastRow="0" w:firstColumn="1" w:lastColumn="0" w:noHBand="0" w:noVBand="1"/>
+      </w:tblPr>
+      <w:tblGrid>
+        <w:gridCol w:w="2245"/>
+        <w:gridCol w:w="2520"/>
+        <w:gridCol w:w="1350"/>
+        <w:gridCol w:w="3420"/>
+      </w:tblGrid>
+      <w:tr>
+        <w:tc>
+          <w:tcPr>
+            <w:tcW w:w="2245" w:type="dxa"/>
+          </w:tcPr>
+          <w:p>
+            <w:pPr>
+              <w:rPr>
+                <w:b/>
+                <w:bCs/>
+                <w:color w:val="467886" w:themeColor="hyperlink"/>
+                <w:sz w:val="16"/>
+                <w:szCs w:val="16"/>
+                <w:u w:val="single"/>
+              </w:rPr>
+            </w:pPr>
+            <w:r>
+              <w:rPr>
+                <w:b/>
+                <w:bCs/>
+                <w:color w:val="467886" w:themeColor="hyperlink"/>
+                <w:sz w:val="16"/>
+                <w:szCs w:val="16"/>
+                <w:u w:val="single"/>
+              </w:rPr>
+              <w:t>Items</w:t>
+            </w:r>
+          </w:p>
+        </w:tc>
+        <w:tc>
+          <w:tcPr>
+            <w:tcW w:w="2520" w:type="dxa"/>
+          </w:tcPr>
+          <w:p>
+            <w:pPr>
+              <w:rPr>
+                <w:b/>
+                <w:bCs/>
+                <w:color w:val="467886" w:themeColor="hyperlink"/>
+                <w:sz w:val="16"/>
+                <w:szCs w:val="16"/>
+                <w:u w:val="single"/>
+              </w:rPr>
+            </w:pPr>
+            <w:r>
+              <w:rPr>
+                <w:b/>
+                <w:bCs/>
+                <w:color w:val="467886" w:themeColor="hyperlink"/>
+                <w:sz w:val="16"/>
+                <w:szCs w:val="16"/>
+                <w:u w:val="single"/>
+              </w:rPr>
+              <w:t xml:space="preserve">Ratio = Value/weight </w:t>
+            </w:r>
+          </w:p>
+        </w:tc>
+        <w:tc>
+          <w:tcPr>
+            <w:tcW w:w="1350" w:type="dxa"/>
+          </w:tcPr>
+          <w:p>
+            <w:pPr>
+              <w:rPr>
+                <w:b/>
+                <w:bCs/>
+                <w:color w:val="467886" w:themeColor="hyperlink"/>
+                <w:sz w:val="16"/>
+                <w:szCs w:val="16"/>
+                <w:u w:val="single"/>
+              </w:rPr>
+            </w:pPr>
+            <w:r>
+              <w:rPr>
+                <w:b/>
+                <w:bCs/>
+                <w:color w:val="467886" w:themeColor="hyperlink"/>
+                <w:sz w:val="16"/>
+                <w:szCs w:val="16"/>
+                <w:u w:val="single"/>
+              </w:rPr>
+              <w:t>Result</w:t>
+            </w:r>
+          </w:p>
+        </w:tc>
+        <w:tc>
+          <w:tcPr>
+            <w:tcW w:w="3420" w:type="dxa"/>
+          </w:tcPr>
+          <w:p>
+            <w:pPr>
+              <w:rPr>
+                <w:b/>
+                <w:bCs/>
+                <w:color w:val="467886" w:themeColor="hyperlink"/>
+                <w:sz w:val="16"/>
+                <w:szCs w:val="16"/>
+                <w:u w:val="single"/>
+              </w:rPr>
+            </w:pPr>
+            <w:r>
+              <w:rPr>
+                <w:b/>
+                <w:bCs/>
+                <w:color w:val="467886" w:themeColor="hyperlink"/>
+                <w:sz w:val="16"/>
+                <w:szCs w:val="16"/>
+                <w:u w:val="single"/>
+              </w:rPr>
+              <w:t>Sorted in descending order</w:t>
+            </w:r>
+          </w:p>
+        </w:tc>
+      </w:tr>
+      <w:tr>
+        <w:tc>
+          <w:tcPr>
+            <w:tcW w:w="2245" w:type="dxa"/>
+          </w:tcPr>
+          <w:p>
+            <w:pPr>
+              <w:rPr>
+                <w:b/>
+                <w:bCs/>
+                <w:color w:val="467886" w:themeColor="hyperlink"/>
+                <w:sz w:val="16"/>
+                <w:szCs w:val="16"/>
+                <w:u w:val="single"/>
+              </w:rPr>
+            </w:pPr>
+            <w:r>
+              <w:rPr>
+                <w:b/>
+                <w:bCs/>
+                <w:color w:val="467886" w:themeColor="hyperlink"/>
+                <w:sz w:val="16"/>
+                <w:szCs w:val="16"/>
+                <w:u w:val="single"/>
+              </w:rPr>
+              <w:t>a</w:t>
+            </w:r>
+          </w:p>
+        </w:tc>
+        <w:tc>
+          <w:tcPr>
+            <w:tcW w:w="2520" w:type="dxa"/>
+          </w:tcPr>
+          <w:p>
+            <w:pPr>
+              <w:rPr>
+                <w:b/>
+                <w:bCs/>
+                <w:color w:val="467886" w:themeColor="hyperlink"/>
+                <w:sz w:val="16"/>
+                <w:szCs w:val="16"/>
+                <w:u w:val="single"/>
+              </w:rPr>
+            </w:pPr>
+            <w:r>
+              <w:rPr>
+                <w:b/>
+                <w:bCs/>
+                <w:color w:val="467886" w:themeColor="hyperlink"/>
+                <w:sz w:val="16"/>
+                <w:szCs w:val="16"/>
+                <w:u w:val="single"/>
+              </w:rPr>
+              <w:t>25/5</w:t>
+            </w:r>
+          </w:p>
+        </w:tc>
+        <w:tc>
+          <w:tcPr>
+            <w:tcW w:w="1350" w:type="dxa"/>
+          </w:tcPr>
+          <w:p>
+            <w:pPr>
+              <w:rPr>
+                <w:b/>
+                <w:bCs/>
+                <w:color w:val="467886" w:themeColor="hyperlink"/>
+                <w:sz w:val="16"/>
+                <w:szCs w:val="16"/>
+                <w:u w:val="single"/>
+              </w:rPr>
+            </w:pPr>
+            <w:r>
+              <w:rPr>
+                <w:b/>
+                <w:bCs/>
+                <w:color w:val="467886" w:themeColor="hyperlink"/>
+                <w:sz w:val="16"/>
+                <w:szCs w:val="16"/>
+                <w:u w:val="single"/>
+              </w:rPr>
+              <w:t>5</w:t>
+            </w:r>
+          </w:p>
+        </w:tc>
+        <w:tc>
+          <w:tcPr>
+            <w:tcW w:w="3420" w:type="dxa"/>
+            <w:vMerge w:val="restart"/>
+          </w:tcPr>
+          <w:p>
+            <w:pPr>
+              <w:rPr>
+                <w:b/>
+                <w:bCs/>
+                <w:color w:val="467886" w:themeColor="hyperlink"/>
+                <w:sz w:val="16"/>
+                <w:szCs w:val="16"/>
+                <w:u w:val="single"/>
+              </w:rPr>
+            </w:pPr>
+            <w:r>
+              <w:rPr>
+                <w:b/>
+                <w:bCs/>
+                <w:color w:val="467886" w:themeColor="hyperlink"/>
+                <w:sz w:val="16"/>
+                <w:szCs w:val="16"/>
+                <w:u w:val="single"/>
+              </w:rPr>
+              <w:t>{d,a,e,c,b}</w:t>
+            </w:r>
+          </w:p>
+        </w:tc>
+      </w:tr>
+      <w:tr>
+        <w:tc>
+          <w:tcPr>
+            <w:tcW w:w="2245" w:type="dxa"/>
+          </w:tcPr>
+          <w:p>
+            <w:pPr>
+              <w:rPr>
+                <w:b/>
+                <w:bCs/>
+                <w:color w:val="467886" w:themeColor="hyperlink"/>
+                <w:sz w:val="16"/>
+                <w:szCs w:val="16"/>
+                <w:u w:val="single"/>
+              </w:rPr>
+            </w:pPr>
+            <w:r>
+              <w:rPr>
+                <w:b/>
+                <w:bCs/>
+                <w:color w:val="467886" w:themeColor="hyperlink"/>
+                <w:sz w:val="16"/>
+                <w:szCs w:val="16"/>
+                <w:u w:val="single"/>
+              </w:rPr>
+              <w:t>b</w:t>
+            </w:r>
+          </w:p>
+        </w:tc>
+        <w:tc>
+          <w:tcPr>
+            <w:tcW w:w="2520" w:type="dxa"/>
+          </w:tcPr>
+          <w:p>
+            <w:pPr>
+              <w:rPr>
+                <w:b/>
+                <w:bCs/>
+                <w:color w:val="467886" w:themeColor="hyperlink"/>
+                <w:sz w:val="16"/>
+                <w:szCs w:val="16"/>
+                <w:u w:val="single"/>
+              </w:rPr>
+            </w:pPr>
+            <w:r>
+              <w:rPr>
+                <w:b/>
+                <w:bCs/>
+                <w:color w:val="467886" w:themeColor="hyperlink"/>
+                <w:sz w:val="16"/>
+                <w:szCs w:val="16"/>
+                <w:u w:val="single"/>
+              </w:rPr>
+              <w:t>12/6</w:t>
+            </w:r>
+          </w:p>
+        </w:tc>
+        <w:tc>
+          <w:tcPr>
+            <w:tcW w:w="1350" w:type="dxa"/>
+          </w:tcPr>
+          <w:p>
+            <w:pPr>
+              <w:rPr>
+                <w:b/>
+                <w:bCs/>
+                <w:color w:val="467886" w:themeColor="hyperlink"/>
+                <w:sz w:val="16"/>
+                <w:szCs w:val="16"/>
+                <w:u w:val="single"/>
+              </w:rPr>
+            </w:pPr>
+            <w:r>
+              <w:rPr>
+                <w:b/>
+                <w:bCs/>
+                <w:color w:val="467886" w:themeColor="hyperlink"/>
+                <w:sz w:val="16"/>
+                <w:szCs w:val="16"/>
+                <w:u w:val="single"/>
+              </w:rPr>
+              <w:t>2</w:t>
+            </w:r>
+          </w:p>
+        </w:tc>
+        <w:tc>
+          <w:tcPr>
+            <w:tcW w:w="3420" w:type="dxa"/>
+            <w:vMerge/>
+          </w:tcPr>
+          <w:p>
+            <w:pPr>
+              <w:rPr>
+                <w:b/>
+                <w:bCs/>
+                <w:color w:val="467886" w:themeColor="hyperlink"/>
+                <w:sz w:val="16"/>
+                <w:szCs w:val="16"/>
+                <w:u w:val="single"/>
+              </w:rPr>
+            </w:pPr>
+          </w:p>
+        </w:tc>
+      </w:tr>
+      <w:tr>
+        <w:tc>
+          <w:tcPr>
+            <w:tcW w:w="2245" w:type="dxa"/>
+          </w:tcPr>
+          <w:p>
+            <w:pPr>
+              <w:rPr>
+                <w:b/>
+                <w:bCs/>
+                <w:color w:val="467886" w:themeColor="hyperlink"/>
+                <w:sz w:val="16"/>
+                <w:szCs w:val="16"/>
+                <w:u w:val="single"/>
+              </w:rPr>
+            </w:pPr>
+            <w:r>
+              <w:rPr>
+                <w:b/>
+                <w:bCs/>
+                <w:color w:val="467886" w:themeColor="hyperlink"/>
+                <w:sz w:val="16"/>
+                <w:szCs w:val="16"/>
+                <w:u w:val="single"/>
+              </w:rPr>
+              <w:t>c</w:t>
+            </w:r>
+          </w:p>
+        </w:tc>
+        <w:tc>
+          <w:tcPr>
+            <w:tcW w:w="2520" w:type="dxa"/>
+          </w:tcPr>
+          <w:p>
+            <w:pPr>
+              <w:rPr>
+                <w:b/>
+                <w:bCs/>
+                <w:color w:val="467886" w:themeColor="hyperlink"/>
+                <w:sz w:val="16"/>
+                <w:szCs w:val="16"/>
+                <w:u w:val="single"/>
+              </w:rPr>
+            </w:pPr>
+            <w:r>
+              <w:rPr>
+                <w:b/>
+                <w:bCs/>
+                <w:color w:val="467886" w:themeColor="hyperlink"/>
+                <w:sz w:val="16"/>
+                <w:szCs w:val="16"/>
+                <w:u w:val="single"/>
+              </w:rPr>
+              <w:t>24/8</w:t>
+            </w:r>
+          </w:p>
+        </w:tc>
+        <w:tc>
+          <w:tcPr>
+            <w:tcW w:w="1350" w:type="dxa"/>
+          </w:tcPr>
+          <w:p>
+            <w:pPr>
+              <w:rPr>
+                <w:b/>
+                <w:bCs/>
+                <w:color w:val="467886" w:themeColor="hyperlink"/>
+                <w:sz w:val="16"/>
+                <w:szCs w:val="16"/>
+                <w:u w:val="single"/>
+              </w:rPr>
+            </w:pPr>
+            <w:r>
+              <w:rPr>
+                <w:b/>
+                <w:bCs/>
+                <w:color w:val="467886" w:themeColor="hyperlink"/>
+                <w:sz w:val="16"/>
+                <w:szCs w:val="16"/>
+                <w:u w:val="single"/>
+              </w:rPr>
+              <w:t>3</w:t>
+            </w:r>
+          </w:p>
+        </w:tc>
+        <w:tc>
+          <w:tcPr>
+            <w:tcW w:w="3420" w:type="dxa"/>
+            <w:vMerge/>
+          </w:tcPr>
+          <w:p>
+            <w:pPr>
+              <w:rPr>
+                <w:b/>
+                <w:bCs/>
+                <w:color w:val="467886" w:themeColor="hyperlink"/>
+                <w:sz w:val="16"/>
+                <w:szCs w:val="16"/>
+                <w:u w:val="single"/>
+              </w:rPr>
+            </w:pPr>
+          </w:p>
+        </w:tc>
+      </w:tr>
+      <w:tr>
+        <w:tc>
+          <w:tcPr>
+            <w:tcW w:w="2245" w:type="dxa"/>
+          </w:tcPr>
+          <w:p>
+            <w:pPr>
+              <w:rPr>
+                <w:b/>
+                <w:bCs/>
+                <w:color w:val="467886" w:themeColor="hyperlink"/>
+                <w:sz w:val="16"/>
+                <w:szCs w:val="16"/>
+                <w:u w:val="single"/>
+              </w:rPr>
+            </w:pPr>
+            <w:r>
+              <w:rPr>
+                <w:b/>
+                <w:bCs/>
+                <w:color w:val="467886" w:themeColor="hyperlink"/>
+                <w:sz w:val="16"/>
+                <w:szCs w:val="16"/>
+                <w:u w:val="single"/>
+              </w:rPr>
+              <w:t>d</w:t>
+            </w:r>
+          </w:p>
+        </w:tc>
+        <w:tc>
+          <w:tcPr>
+            <w:tcW w:w="2520" w:type="dxa"/>
+          </w:tcPr>
+          <w:p>
+            <w:pPr>
+              <w:rPr>
+                <w:b/>
+                <w:bCs/>
+                <w:color w:val="467886" w:themeColor="hyperlink"/>
+                <w:sz w:val="16"/>
+                <w:szCs w:val="16"/>
+                <w:u w:val="single"/>
+              </w:rPr>
+            </w:pPr>
+            <w:r>
+              <w:rPr>
+                <w:b/>
+                <w:bCs/>
+                <w:color w:val="467886" w:themeColor="hyperlink"/>
+                <w:sz w:val="16"/>
+                <w:szCs w:val="16"/>
+                <w:u w:val="single"/>
+              </w:rPr>
+              <w:t>16/2</w:t>
+            </w:r>
+          </w:p>
+        </w:tc>
+        <w:tc>
+          <w:tcPr>
+            <w:tcW w:w="1350" w:type="dxa"/>
+          </w:tcPr>
+          <w:p>
+            <w:pPr>
+              <w:rPr>
+                <w:b/>
+                <w:bCs/>
+                <w:color w:val="467886" w:themeColor="hyperlink"/>
+                <w:sz w:val="16"/>
+                <w:szCs w:val="16"/>
+                <w:u w:val="single"/>
+              </w:rPr>
+            </w:pPr>
+            <w:r>
+              <w:rPr>
+                <w:b/>
+                <w:bCs/>
+                <w:color w:val="467886" w:themeColor="hyperlink"/>
+                <w:sz w:val="16"/>
+                <w:szCs w:val="16"/>
+                <w:u w:val="single"/>
+              </w:rPr>
+              <w:t>8</w:t>
+            </w:r>
+          </w:p>
+        </w:tc>
+        <w:tc>
+          <w:tcPr>
+            <w:tcW w:w="3420" w:type="dxa"/>
+            <w:vMerge/>
+          </w:tcPr>
+          <w:p>
+            <w:pPr>
+              <w:rPr>
+                <w:b/>
+                <w:bCs/>
+                <w:color w:val="467886" w:themeColor="hyperlink"/>
+                <w:sz w:val="16"/>
+                <w:szCs w:val="16"/>
+                <w:u w:val="single"/>
+              </w:rPr>
+            </w:pPr>
+          </w:p>
+        </w:tc>
+      </w:tr>
+      <w:tr>
+        <w:tc>
+          <w:tcPr>
+            <w:tcW w:w="2245" w:type="dxa"/>
+          </w:tcPr>
+          <w:p>
+            <w:pPr>
+              <w:rPr>
+                <w:b/>
+                <w:bCs/>
+                <w:color w:val="467886" w:themeColor="hyperlink"/>
+                <w:sz w:val="16"/>
+                <w:szCs w:val="16"/>
+                <w:u w:val="single"/>
+              </w:rPr>
+            </w:pPr>
+            <w:r>
+              <w:rPr>
+                <w:b/>
+                <w:bCs/>
+                <w:color w:val="467886" w:themeColor="hyperlink"/>
+                <w:sz w:val="16"/>
+                <w:szCs w:val="16"/>
+                <w:u w:val="single"/>
+              </w:rPr>
+              <w:t>e</w:t>
+            </w:r>
+          </w:p>
+        </w:tc>
+        <w:tc>
+          <w:tcPr>
+            <w:tcW w:w="2520" w:type="dxa"/>
+          </w:tcPr>
+          <w:p>
+            <w:pPr>
+              <w:rPr>
+                <w:b/>
+                <w:bCs/>
+                <w:color w:val="467886" w:themeColor="hyperlink"/>
+                <w:sz w:val="16"/>
+                <w:szCs w:val="16"/>
+                <w:u w:val="single"/>
+              </w:rPr>
+            </w:pPr>
+            <w:r>
+              <w:rPr>
+                <w:b/>
+                <w:bCs/>
+                <w:color w:val="467886" w:themeColor="hyperlink"/>
+                <w:sz w:val="16"/>
+                <w:szCs w:val="16"/>
+                <w:u w:val="single"/>
+              </w:rPr>
+              <w:t>28/7</w:t>
+            </w:r>
+          </w:p>
+        </w:tc>
+        <w:tc>
+          <w:tcPr>
+            <w:tcW w:w="1350" w:type="dxa"/>
+          </w:tcPr>
+          <w:p>
+            <w:pPr>
+              <w:rPr>
+                <w:b/>
+                <w:bCs/>
+                <w:color w:val="467886" w:themeColor="hyperlink"/>
+                <w:sz w:val="16"/>
+                <w:szCs w:val="16"/>
+                <w:u w:val="single"/>
+              </w:rPr>
+            </w:pPr>
+            <w:r>
+              <w:rPr>
+                <w:b/>
+                <w:bCs/>
+                <w:color w:val="467886" w:themeColor="hyperlink"/>
+                <w:sz w:val="16"/>
+                <w:szCs w:val="16"/>
+                <w:u w:val="single"/>
+              </w:rPr>
+              <w:t>4</w:t>
+            </w:r>
+          </w:p>
+        </w:tc>
+        <w:tc>
+          <w:tcPr>
+            <w:tcW w:w="3420" w:type="dxa"/>
+            <w:vMerge/>
+          </w:tcPr>
+          <w:p>
+            <w:pPr>
+              <w:rPr>
+                <w:b/>
+                <w:bCs/>
+                <w:color w:val="467886" w:themeColor="hyperlink"/>
+                <w:sz w:val="16"/>
+                <w:szCs w:val="16"/>
+                <w:u w:val="single"/>
+              </w:rPr>
+            </w:pPr>
+          </w:p>
+        </w:tc>
+      </w:tr>
+    </w:tbl>
+    <w:p>
+      <w:pPr>
+        <w:rPr>
+          <w:b/>
+          <w:bCs/>
+          <w:color w:val="467886" w:themeColor="hyperlink"/>
+          <w:sz w:val="16"/>
+          <w:szCs w:val="16"/>
+          <w:u w:val="single"/>
+        </w:rPr>
+      </w:pPr>
+      <w:r>
+        <w:rPr>
+          <w:b/>
+          <w:bCs/>
+          <w:color w:val="467886" w:themeColor="hyperlink"/>
+          <w:sz w:val="16"/>
+          <w:szCs w:val="16"/>
+          <w:u w:val="single"/>
+        </w:rPr>
+        <w:t>Max weight =20</w:t>
+      </w:r>
+      <w:r>
+        <w:rPr>
+          <w:b/>
+          <w:bCs/>
+          <w:color w:val="467886" w:themeColor="hyperlink"/>
+          <w:sz w:val="16"/>
+          <w:szCs w:val="16"/>
+          <w:u w:val="single"/>
+        </w:rPr>
+        <w:t xml:space="preserve"> {d mean 20-2 =18, a mean 18-5 = 13, e mean 13-7 = 6, b mean 6-6 =0 } no more space in the sack {</w:t>
+      </w:r>
+      <w:r>
+        <w:rPr>
+          <w:b/>
+          <w:bCs/>
+          <w:color w:val="467886" w:themeColor="hyperlink"/>
+          <w:sz w:val="16"/>
+          <w:szCs w:val="16"/>
+          <w:u w:val="single"/>
+        </w:rPr>
+        <w:t>d,a,e,b</w:t>
+      </w:r>
+      <w:r>
+        <w:rPr>
+          <w:b/>
+          <w:bCs/>
+          <w:color w:val="467886" w:themeColor="hyperlink"/>
+          <w:sz w:val="16"/>
+          <w:szCs w:val="16"/>
+          <w:u w:val="single"/>
+        </w:rPr>
+        <w:t>}</w:t>
+      </w:r>
     </w:p>
     <w:p>
       <w:pPr>
@@ -12704,9 +13031,34 @@
           <w:b/>
           <w:bCs/>
           <w:color w:val="467886" w:themeColor="hyperlink"/>
+          <w:sz w:val="16"/>
+          <w:szCs w:val="16"/>
           <w:u w:val="single"/>
         </w:rPr>
       </w:pPr>
+      <w:r>
+        <w:rPr>
+          <w:b/>
+          <w:bCs/>
+          <w:color w:val="467886" w:themeColor="hyperlink"/>
+          <w:sz w:val="16"/>
+          <w:szCs w:val="16"/>
+          <w:u w:val="single"/>
+        </w:rPr>
+        <w:lastRenderedPageBreak/>
+        <w:t xml:space="preserve">Total profit value after filling the bag = </w:t>
+      </w:r>
+      <w:r>
+        <w:rPr>
+          <w:b/>
+          <w:bCs/>
+          <w:color w:val="467886" w:themeColor="hyperlink"/>
+          <w:sz w:val="16"/>
+          <w:szCs w:val="16"/>
+          <w:u w:val="single"/>
+        </w:rPr>
+        <w:t>16+15+28+12 =81</w:t>
+      </w:r>
     </w:p>
     <w:p>
       <w:pPr>

</xml_diff>